<commit_message>
HW2: add final report PDF (Achutuni_DATA260_HW2.pdf + report.pdf)
Co-Authored-By: Claude Sonnet 5 <noreply@anthropic.com>
</commit_message>
<xml_diff>
--- a/reports/hw02/DATA 260 HW 2 Report FINAL.docx
+++ b/reports/hw02/DATA 260 HW 2 Report FINAL.docx
@@ -35,8 +35,8 @@
         <w:tblLook w:val="04A0" w:firstRow="1" w:lastRow="0" w:firstColumn="1" w:lastColumn="0" w:noHBand="0" w:noVBand="1"/>
       </w:tblPr>
       <w:tblGrid>
-        <w:gridCol w:w="4320"/>
-        <w:gridCol w:w="4320"/>
+        <w:gridCol w:w="4302"/>
+        <w:gridCol w:w="4554"/>
       </w:tblGrid>
       <w:tr>
         <w:trPr>
@@ -328,7 +328,7 @@
               <w:cnfStyle w:val="000000100000" w:firstRow="0" w:lastRow="0" w:firstColumn="0" w:lastColumn="0" w:oddVBand="0" w:evenVBand="0" w:oddHBand="1" w:evenHBand="0" w:firstRowFirstColumn="0" w:firstRowLastColumn="0" w:lastRowFirstColumn="0" w:lastRowLastColumn="0"/>
             </w:pPr>
             <w:r>
-              <w:t>to be filled in once everything below is final and pushed</w:t>
+              <w:t>7ae65ed5058241c70c44fca8bd3a5800ce95db02</w:t>
             </w:r>
           </w:p>
         </w:tc>
@@ -3187,7 +3187,6 @@
   <w:style w:type="character" w:default="1" w:styleId="DefaultParagraphFont">
     <w:name w:val="Default Paragraph Font"/>
     <w:uiPriority w:val="1"/>
-    <w:semiHidden/>
     <w:unhideWhenUsed/>
   </w:style>
   <w:style w:type="table" w:default="1" w:styleId="TableNormal">

</xml_diff>